<commit_message>
alerta en el admin para informacion de ampliacion de cupos
</commit_message>
<xml_diff>
--- a/pagina aws.docx
+++ b/pagina aws.docx
@@ -2,6 +2,32 @@
 <file path=word/document.xml><?xml version="1.0" encoding="utf-8"?>
 <w:document xmlns:wpc="http://schemas.microsoft.com/office/word/2010/wordprocessingCanvas" xmlns:mc="http://schemas.openxmlformats.org/markup-compatibility/2006" xmlns:o="urn:schemas-microsoft-com:office:office" xmlns:r="http://schemas.openxmlformats.org/officeDocument/2006/relationships" xmlns:m="http://schemas.openxmlformats.org/officeDocument/2006/math" xmlns:v="urn:schemas-microsoft-com:vml" xmlns:wp14="http://schemas.microsoft.com/office/word/2010/wordprocessingDrawing" xmlns:wp="http://schemas.openxmlformats.org/drawingml/2006/wordprocessingDrawing" xmlns:w10="urn:schemas-microsoft-com:office:word" xmlns:w="http://schemas.openxmlformats.org/wordprocessingml/2006/main" xmlns:w14="http://schemas.microsoft.com/office/word/2010/wordml" xmlns:w15="http://schemas.microsoft.com/office/word/2012/wordml" xmlns:wpg="http://schemas.microsoft.com/office/word/2010/wordprocessingGroup" xmlns:wpi="http://schemas.microsoft.com/office/word/2010/wordprocessingInk" xmlns:wne="http://schemas.microsoft.com/office/word/2006/wordml" xmlns:wps="http://schemas.microsoft.com/office/word/2010/wordprocessingShape" mc:Ignorable="w14 w15 wp14">
   <w:body>
+    <w:p>
+      <w:r>
+        <w:t xml:space="preserve">Correo: </w:t>
+      </w:r>
+      <w:hyperlink r:id="rId5" w:history="1">
+        <w:r>
+          <w:rPr>
+            <w:rStyle w:val="Hipervnculo"/>
+          </w:rPr>
+          <w:t>Jonathan.ramirez@mybosi.com</w:t>
+        </w:r>
+      </w:hyperlink>
+    </w:p>
+    <w:p>
+      <w:r>
+        <w:t>Contraseña: CC1036622332*.*</w:t>
+      </w:r>
+      <w:bookmarkStart w:id="0" w:name="_GoBack"/>
+      <w:bookmarkEnd w:id="0"/>
+    </w:p>
+    <w:p>
+      <w:r>
+        <w:t>Por AUTENTICADOR DE MICROSOFT: AMAZON WEB SERVICES</w:t>
+      </w:r>
+    </w:p>
+    <w:p/>
     <w:p>
       <w:r>
         <w:rPr>
@@ -26,7 +52,7 @@
                     </pic:cNvPicPr>
                   </pic:nvPicPr>
                   <pic:blipFill>
-                    <a:blip r:embed="rId5">
+                    <a:blip r:embed="rId6">
                       <a:extLst>
                         <a:ext uri="{28A0092B-C50C-407E-A947-70E740481C1C}">
                           <a14:useLocalDpi xmlns:a14="http://schemas.microsoft.com/office/drawing/2010/main" val="0"/>
@@ -83,7 +109,7 @@
                     </pic:cNvPicPr>
                   </pic:nvPicPr>
                   <pic:blipFill>
-                    <a:blip r:embed="rId6">
+                    <a:blip r:embed="rId7">
                       <a:extLst>
                         <a:ext uri="{28A0092B-C50C-407E-A947-70E740481C1C}">
                           <a14:useLocalDpi xmlns:a14="http://schemas.microsoft.com/office/drawing/2010/main" val="0"/>
@@ -140,7 +166,7 @@
                     </pic:cNvPicPr>
                   </pic:nvPicPr>
                   <pic:blipFill>
-                    <a:blip r:embed="rId7">
+                    <a:blip r:embed="rId8">
                       <a:extLst>
                         <a:ext uri="{28A0092B-C50C-407E-A947-70E740481C1C}">
                           <a14:useLocalDpi xmlns:a14="http://schemas.microsoft.com/office/drawing/2010/main" val="0"/>
@@ -196,7 +222,7 @@
                     </pic:cNvPicPr>
                   </pic:nvPicPr>
                   <pic:blipFill>
-                    <a:blip r:embed="rId8">
+                    <a:blip r:embed="rId9">
                       <a:extLst>
                         <a:ext uri="{28A0092B-C50C-407E-A947-70E740481C1C}">
                           <a14:useLocalDpi xmlns:a14="http://schemas.microsoft.com/office/drawing/2010/main" val="0"/>
@@ -253,7 +279,7 @@
                     </pic:cNvPicPr>
                   </pic:nvPicPr>
                   <pic:blipFill>
-                    <a:blip r:embed="rId9" cstate="print">
+                    <a:blip r:embed="rId10" cstate="print">
                       <a:extLst>
                         <a:ext uri="{28A0092B-C50C-407E-A947-70E740481C1C}">
                           <a14:useLocalDpi xmlns:a14="http://schemas.microsoft.com/office/drawing/2010/main" val="0"/>
@@ -309,7 +335,7 @@
                     </pic:cNvPicPr>
                   </pic:nvPicPr>
                   <pic:blipFill>
-                    <a:blip r:embed="rId10" cstate="print">
+                    <a:blip r:embed="rId11" cstate="print">
                       <a:extLst>
                         <a:ext uri="{28A0092B-C50C-407E-A947-70E740481C1C}">
                           <a14:useLocalDpi xmlns:a14="http://schemas.microsoft.com/office/drawing/2010/main" val="0"/>
@@ -360,7 +386,7 @@
           <w:lang w:eastAsia="es-CO"/>
         </w:rPr>
       </w:pPr>
-      <w:hyperlink r:id="rId11" w:tgtFrame="_blank" w:history="1">
+      <w:hyperlink r:id="rId12" w:tgtFrame="_blank" w:history="1">
         <w:r>
           <w:rPr>
             <w:rFonts w:ascii="Segoe UI" w:eastAsia="Times New Roman" w:hAnsi="Segoe UI" w:cs="Segoe UI"/>
@@ -478,7 +504,7 @@
         </w:rPr>
         <w:t>: </w:t>
       </w:r>
-      <w:hyperlink r:id="rId12" w:tgtFrame="_blank" w:history="1">
+      <w:hyperlink r:id="rId13" w:tgtFrame="_blank" w:history="1">
         <w:r>
           <w:rPr>
             <w:rFonts w:ascii="Segoe UI" w:eastAsia="Times New Roman" w:hAnsi="Segoe UI" w:cs="Segoe UI"/>
@@ -526,7 +552,7 @@
         </w:rPr>
         <w:t>Registro: </w:t>
       </w:r>
-      <w:hyperlink r:id="rId13" w:tgtFrame="_blank" w:history="1">
+      <w:hyperlink r:id="rId14" w:tgtFrame="_blank" w:history="1">
         <w:r>
           <w:rPr>
             <w:rFonts w:ascii="Segoe UI" w:eastAsia="Times New Roman" w:hAnsi="Segoe UI" w:cs="Segoe UI"/>
@@ -608,7 +634,7 @@
         </w:rPr>
         <w:t>: </w:t>
       </w:r>
-      <w:hyperlink r:id="rId14" w:tgtFrame="_blank" w:history="1">
+      <w:hyperlink r:id="rId15" w:tgtFrame="_blank" w:history="1">
         <w:r>
           <w:rPr>
             <w:rFonts w:ascii="Segoe UI" w:eastAsia="Times New Roman" w:hAnsi="Segoe UI" w:cs="Segoe UI"/>
@@ -652,10 +678,7 @@
         <w:t>Cuando confirmes que abre bien, seguimos con el dominio y luego HTTPS.</w:t>
       </w:r>
     </w:p>
-    <w:p>
-      <w:bookmarkStart w:id="0" w:name="_GoBack"/>
-      <w:bookmarkEnd w:id="0"/>
-    </w:p>
+    <w:p/>
     <w:sectPr>
       <w:pgSz w:w="12240" w:h="15840"/>
       <w:pgMar w:top="1417" w:right="1701" w:bottom="1417" w:left="1701" w:header="708" w:footer="708" w:gutter="0"/>
@@ -1263,6 +1286,17 @@
     <w:basedOn w:val="Fuentedeprrafopredeter"/>
     <w:rsid w:val="00F33D06"/>
   </w:style>
+  <w:style w:type="character" w:styleId="Hipervnculo">
+    <w:name w:val="Hyperlink"/>
+    <w:basedOn w:val="Fuentedeprrafopredeter"/>
+    <w:uiPriority w:val="99"/>
+    <w:unhideWhenUsed/>
+    <w:rsid w:val="002A22C5"/>
+    <w:rPr>
+      <w:color w:val="0563C1" w:themeColor="hyperlink"/>
+      <w:u w:val="single"/>
+    </w:rPr>
+  </w:style>
 </w:styles>
 </file>
 

</xml_diff>